<commit_message>
Include 에스테틱 in ₩790,000 package (₩80,000 cost, 67.6% ratio)
Co-Authored-By: Claude Sonnet 4.6 <noreply@anthropic.com>
Claude-Session: https://claude.ai/code/session_01MLXVgnN287g9x8qaYbB4vD
</commit_message>
<xml_diff>
--- a/packages/고객공유용_79만원_RealKoreanGirl.docx
+++ b/packages/고객공유용_79만원_RealKoreanGirl.docx
@@ -782,7 +782,7 @@
                 <w:rFonts w:ascii="Malgun Gothic" w:hAnsi="Malgun Gothic"/>
                 <w:sz w:val="18"/>
               </w:rPr>
-              <w:t>💳 현장결제</w:t>
+              <w:t>✅ 포함</w:t>
             </w:r>
           </w:p>
         </w:tc>
@@ -1448,6 +1448,17 @@
         <w:rPr>
           <w:rFonts w:ascii="Malgun Gothic" w:hAnsi="Malgun Gothic"/>
         </w:rPr>
+        <w:t>피부진단 &amp; 에스테틱</w:t>
+      </w:r>
+    </w:p>
+    <w:p>
+      <w:pPr>
+        <w:pStyle w:val="ListBullet"/>
+      </w:pPr>
+      <w:r>
+        <w:rPr>
+          <w:rFonts w:ascii="Malgun Gothic" w:hAnsi="Malgun Gothic"/>
+        </w:rPr>
         <w:t>데일리 헤어 &amp; 메이크업</w:t>
       </w:r>
     </w:p>
@@ -1962,36 +1973,6 @@
                 <w:rFonts w:ascii="Malgun Gothic" w:hAnsi="Malgun Gothic"/>
                 <w:sz w:val="20"/>
               </w:rPr>
-              <w:t>에스테틱 시술비</w:t>
-            </w:r>
-          </w:p>
-        </w:tc>
-        <w:tc>
-          <w:tcPr>
-            <w:tcW w:type="dxa" w:w="4320"/>
-          </w:tcPr>
-          <w:p>
-            <w:r>
-              <w:rPr>
-                <w:rFonts w:ascii="Malgun Gothic" w:hAnsi="Malgun Gothic"/>
-                <w:sz w:val="20"/>
-              </w:rPr>
-              <w:t>💳 현장결제</w:t>
-            </w:r>
-          </w:p>
-        </w:tc>
-      </w:tr>
-      <w:tr>
-        <w:tc>
-          <w:tcPr>
-            <w:tcW w:type="dxa" w:w="4320"/>
-          </w:tcPr>
-          <w:p>
-            <w:r>
-              <w:rPr>
-                <w:rFonts w:ascii="Malgun Gothic" w:hAnsi="Malgun Gothic"/>
-                <w:sz w:val="20"/>
-              </w:rPr>
               <w:t>명동 병원 시술비</w:t>
             </w:r>
           </w:p>
@@ -2126,6 +2107,36 @@
                 <w:sz w:val="20"/>
               </w:rPr>
               <w:t>₩148,000</w:t>
+            </w:r>
+          </w:p>
+        </w:tc>
+      </w:tr>
+      <w:tr>
+        <w:tc>
+          <w:tcPr>
+            <w:tcW w:type="dxa" w:w="4320"/>
+          </w:tcPr>
+          <w:p>
+            <w:r>
+              <w:rPr>
+                <w:rFonts w:ascii="Malgun Gothic" w:hAnsi="Malgun Gothic"/>
+                <w:sz w:val="20"/>
+              </w:rPr>
+              <w:t>피부진단 &amp; 에스테틱</w:t>
+            </w:r>
+          </w:p>
+        </w:tc>
+        <w:tc>
+          <w:tcPr>
+            <w:tcW w:type="dxa" w:w="4320"/>
+          </w:tcPr>
+          <w:p>
+            <w:r>
+              <w:rPr>
+                <w:rFonts w:ascii="Malgun Gothic" w:hAnsi="Malgun Gothic"/>
+                <w:sz w:val="20"/>
+              </w:rPr>
+              <w:t>₩80,000</w:t>
             </w:r>
           </w:p>
         </w:tc>
@@ -2335,7 +2346,7 @@
                 <w:rFonts w:ascii="Malgun Gothic" w:hAnsi="Malgun Gothic"/>
                 <w:sz w:val="20"/>
               </w:rPr>
-              <w:t>₩454,000</w:t>
+              <w:t>₩534,000</w:t>
             </w:r>
           </w:p>
         </w:tc>
@@ -2365,7 +2376,7 @@
                 <w:rFonts w:ascii="Malgun Gothic" w:hAnsi="Malgun Gothic"/>
                 <w:sz w:val="20"/>
               </w:rPr>
-              <w:t>57.5% ✅</w:t>
+              <w:t>67.6% ⚠️</w:t>
             </w:r>
           </w:p>
         </w:tc>

</xml_diff>

<commit_message>
Update 티 오마카세 cost to ₩40,000 in ₩790,000 package
Co-Authored-By: Claude Sonnet 4.6 <noreply@anthropic.com>
Claude-Session: https://claude.ai/code/session_01MLXVgnN287g9x8qaYbB4vD
</commit_message>
<xml_diff>
--- a/packages/고객공유용_79만원_RealKoreanGirl.docx
+++ b/packages/고객공유용_79만원_RealKoreanGirl.docx
@@ -522,7 +522,7 @@
                 <w:b/>
                 <w:sz w:val="18"/>
               </w:rPr>
-              <w:t>자(cha) 카페  (1시간)</w:t>
+              <w:t>티 오마카세  (1시간)</w:t>
             </w:r>
           </w:p>
           <w:p>
@@ -533,7 +533,7 @@
               <w:rPr>
                 <w:sz w:val="18"/>
               </w:rPr>
-              <w:t>· 한국 힙한 전통차 카페 경험</w:t>
+              <w:t>· 전통차 소믈리에가 선별한 계절 차 코스 제공</w:t>
             </w:r>
           </w:p>
           <w:p>
@@ -544,7 +544,7 @@
               <w:rPr>
                 <w:sz w:val="18"/>
               </w:rPr>
-              <w:t>· 음료 1잔 포함</w:t>
+              <w:t>· 차 설명 + 다과 페어링 포함</w:t>
             </w:r>
           </w:p>
           <w:p>
@@ -555,7 +555,50 @@
               <w:rPr>
                 <w:sz w:val="18"/>
               </w:rPr>
-              <w:t>· 인스타그래머블 공간</w:t>
+              <w:t>· 명동·인사동 인근 프리미엄 티룸</w:t>
+            </w:r>
+          </w:p>
+          <w:p>
+            <w:pPr>
+              <w:spacing w:before="20" w:after="20"/>
+            </w:pPr>
+            <w:r>
+              <w:rPr>
+                <w:sz w:val="18"/>
+              </w:rPr>
+            </w:r>
+          </w:p>
+          <w:p>
+            <w:pPr>
+              <w:spacing w:before="20" w:after="20"/>
+            </w:pPr>
+            <w:r>
+              <w:rPr>
+                <w:sz w:val="18"/>
+              </w:rPr>
+              <w:t>추천 업체 TOP5</w:t>
+            </w:r>
+          </w:p>
+          <w:p>
+            <w:pPr>
+              <w:spacing w:before="20" w:after="20"/>
+            </w:pPr>
+            <w:r>
+              <w:rPr>
+                <w:sz w:val="18"/>
+              </w:rPr>
+              <w:t>① 오설록 티하우스  ② 차마시는 뜰  ③ 티컬렉티브</w:t>
+            </w:r>
+          </w:p>
+          <w:p>
+            <w:pPr>
+              <w:spacing w:before="20" w:after="20"/>
+            </w:pPr>
+            <w:r>
+              <w:rPr>
+                <w:sz w:val="18"/>
+              </w:rPr>
+              <w:t>④ 명가원  ⑤ 오우재</w:t>
             </w:r>
           </w:p>
           <w:p>
@@ -587,7 +630,7 @@
               <w:rPr>
                 <w:sz w:val="18"/>
               </w:rPr>
-              <w:t xml:space="preserve">   긴장 풀린 상태에서 받아야 시술 효과 극대화</w:t>
+              <w:t xml:space="preserve">   프리미엄 차 코스로 패키지 고급감 UP — 긴장 풀린 상태에서 시술 효과 극대화</w:t>
             </w:r>
           </w:p>
         </w:tc>
@@ -1437,7 +1480,7 @@
         <w:rPr>
           <w:rFonts w:ascii="Malgun Gothic" w:hAnsi="Malgun Gothic"/>
         </w:rPr>
-        <w:t>자카페 음료 1잔</w:t>
+        <w:t>티 오마카세 (전통차 코스 + 다과)</w:t>
       </w:r>
     </w:p>
     <w:p>
@@ -2212,7 +2255,7 @@
                 <w:rFonts w:ascii="Malgun Gothic" w:hAnsi="Malgun Gothic"/>
                 <w:sz w:val="20"/>
               </w:rPr>
-              <w:t>자카페 음료</w:t>
+              <w:t>티 오마카세</w:t>
             </w:r>
           </w:p>
         </w:tc>
@@ -2226,7 +2269,7 @@
                 <w:rFonts w:ascii="Malgun Gothic" w:hAnsi="Malgun Gothic"/>
                 <w:sz w:val="20"/>
               </w:rPr>
-              <w:t>₩12,000</w:t>
+              <w:t>₩40,000</w:t>
             </w:r>
           </w:p>
         </w:tc>
@@ -2346,7 +2389,7 @@
                 <w:rFonts w:ascii="Malgun Gothic" w:hAnsi="Malgun Gothic"/>
                 <w:sz w:val="20"/>
               </w:rPr>
-              <w:t>₩534,000</w:t>
+              <w:t>₩562,000</w:t>
             </w:r>
           </w:p>
         </w:tc>
@@ -2376,7 +2419,7 @@
                 <w:rFonts w:ascii="Malgun Gothic" w:hAnsi="Malgun Gothic"/>
                 <w:sz w:val="20"/>
               </w:rPr>
-              <w:t>67.6% ⚠️</w:t>
+              <w:t>71.1% ⚠️</w:t>
             </w:r>
           </w:p>
         </w:tc>

</xml_diff>